<commit_message>
Update service characteristic autofill and signatory defaults.
Adjust rank handling, refresh signatory data, and refine service/VLK templates for current document wording and layout.

Made-with: Cursor
</commit_message>
<xml_diff>
--- a/templates/service_characteristic.docx
+++ b/templates/service_characteristic.docx
@@ -658,7 +658,17 @@
           <w:szCs w:val="28"/>
           <w14:ligatures w14:val="none"/>
         </w:rPr>
-        <w:t xml:space="preserve">Недопущений до проходження базової військової підготовки, оскільки поточне самопочуття </w:t>
+        <w:t>П</w:t>
+      </w:r>
+      <w:r>
+        <w:rPr>
+          <w:rFonts w:ascii="Times New Roman" w:hAnsi="Times New Roman"/>
+          <w:kern w:val="0"/>
+          <w:sz w:val="28"/>
+          <w:szCs w:val="28"/>
+          <w14:ligatures w14:val="none"/>
+        </w:rPr>
+        <w:t xml:space="preserve">оточне самопочуття </w:t>
       </w:r>
       <w:r>
         <w:rPr>
@@ -1314,6 +1324,21 @@
           <w:kern w:val="0"/>
           <w:sz w:val="28"/>
           <w:szCs w:val="28"/>
+          <w14:ligatures w14:val="none"/>
+        </w:rPr>
+      </w:pPr>
+    </w:p>
+    <w:p>
+      <w:pPr>
+        <w:spacing w:after="0" w:line="240" w:lineRule="auto"/>
+        <w:ind w:right="-1"/>
+        <w:jc w:val="both"/>
+        <w:rPr>
+          <w:rFonts w:ascii="Times New Roman" w:hAnsi="Times New Roman"/>
+          <w:kern w:val="0"/>
+          <w:sz w:val="28"/>
+          <w:szCs w:val="28"/>
+          <w:lang w:val="ru-RU"/>
           <w14:ligatures w14:val="none"/>
         </w:rPr>
       </w:pPr>
@@ -1480,6 +1505,7 @@
           <w:color w:val="000000"/>
           <w:sz w:val="28"/>
           <w:szCs w:val="28"/>
+          <w:lang w:val="ru-RU"/>
         </w:rPr>
         <w:tab/>
       </w:r>

</xml_diff>